<commit_message>
stable version, JSON storage, improve marks
</commit_message>
<xml_diff>
--- a/ТЗ.docx
+++ b/ТЗ.docx
@@ -122,6 +122,12 @@
           <w:u w:val="single"/>
         </w:rPr>
         <w:t>Городской Гид</w:t>
+      </w:r>
+      <w:r>
+        <w:rPr>
+          <w:u w:val="single"/>
+        </w:rPr>
+        <w:t>(Менеджер меток)</w:t>
       </w:r>
     </w:p>
     <w:p>
@@ -776,16 +782,16 @@
         </w:tblCellMar>
       </w:tblPr>
       <w:tblGrid>
-        <w:gridCol w:w="489"/>
+        <w:gridCol w:w="488"/>
         <w:gridCol w:w="2258"/>
-        <w:gridCol w:w="3506"/>
-        <w:gridCol w:w="3385"/>
+        <w:gridCol w:w="3507"/>
+        <w:gridCol w:w="3384"/>
       </w:tblGrid>
       <w:tr>
         <w:trPr/>
         <w:tc>
           <w:tcPr>
-            <w:tcW w:w="489" w:type="dxa"/>
+            <w:tcW w:w="488" w:type="dxa"/>
             <w:tcBorders>
               <w:top w:val="single" w:sz="4" w:space="0" w:color="000000"/>
               <w:start w:val="single" w:sz="4" w:space="0" w:color="000000"/>
@@ -825,7 +831,7 @@
         </w:tc>
         <w:tc>
           <w:tcPr>
-            <w:tcW w:w="3506" w:type="dxa"/>
+            <w:tcW w:w="3507" w:type="dxa"/>
             <w:tcBorders>
               <w:top w:val="single" w:sz="4" w:space="0" w:color="000000"/>
               <w:start w:val="single" w:sz="4" w:space="0" w:color="000000"/>
@@ -845,7 +851,7 @@
         </w:tc>
         <w:tc>
           <w:tcPr>
-            <w:tcW w:w="3385" w:type="dxa"/>
+            <w:tcW w:w="3384" w:type="dxa"/>
             <w:tcBorders>
               <w:top w:val="single" w:sz="4" w:space="0" w:color="000000"/>
               <w:start w:val="single" w:sz="4" w:space="0" w:color="000000"/>
@@ -869,7 +875,7 @@
         <w:trPr/>
         <w:tc>
           <w:tcPr>
-            <w:tcW w:w="489" w:type="dxa"/>
+            <w:tcW w:w="488" w:type="dxa"/>
             <w:tcBorders>
               <w:start w:val="single" w:sz="4" w:space="0" w:color="000000"/>
               <w:bottom w:val="single" w:sz="4" w:space="0" w:color="000000"/>
@@ -910,7 +916,7 @@
         </w:tc>
         <w:tc>
           <w:tcPr>
-            <w:tcW w:w="3506" w:type="dxa"/>
+            <w:tcW w:w="3507" w:type="dxa"/>
             <w:tcBorders>
               <w:start w:val="single" w:sz="4" w:space="0" w:color="000000"/>
               <w:bottom w:val="single" w:sz="4" w:space="0" w:color="000000"/>
@@ -932,7 +938,7 @@
         </w:tc>
         <w:tc>
           <w:tcPr>
-            <w:tcW w:w="3385" w:type="dxa"/>
+            <w:tcW w:w="3384" w:type="dxa"/>
             <w:tcBorders>
               <w:start w:val="single" w:sz="4" w:space="0" w:color="000000"/>
               <w:bottom w:val="single" w:sz="4" w:space="0" w:color="000000"/>
@@ -958,7 +964,7 @@
         <w:trPr/>
         <w:tc>
           <w:tcPr>
-            <w:tcW w:w="489" w:type="dxa"/>
+            <w:tcW w:w="488" w:type="dxa"/>
             <w:tcBorders>
               <w:start w:val="single" w:sz="4" w:space="0" w:color="000000"/>
               <w:bottom w:val="single" w:sz="4" w:space="0" w:color="000000"/>
@@ -999,7 +1005,7 @@
         </w:tc>
         <w:tc>
           <w:tcPr>
-            <w:tcW w:w="3506" w:type="dxa"/>
+            <w:tcW w:w="3507" w:type="dxa"/>
             <w:tcBorders>
               <w:start w:val="single" w:sz="4" w:space="0" w:color="000000"/>
               <w:bottom w:val="single" w:sz="4" w:space="0" w:color="000000"/>
@@ -1021,7 +1027,7 @@
         </w:tc>
         <w:tc>
           <w:tcPr>
-            <w:tcW w:w="3385" w:type="dxa"/>
+            <w:tcW w:w="3384" w:type="dxa"/>
             <w:tcBorders>
               <w:start w:val="single" w:sz="4" w:space="0" w:color="000000"/>
               <w:bottom w:val="single" w:sz="4" w:space="0" w:color="000000"/>
@@ -1051,7 +1057,7 @@
         <w:trPr/>
         <w:tc>
           <w:tcPr>
-            <w:tcW w:w="489" w:type="dxa"/>
+            <w:tcW w:w="488" w:type="dxa"/>
             <w:tcBorders>
               <w:start w:val="single" w:sz="4" w:space="0" w:color="000000"/>
               <w:bottom w:val="single" w:sz="4" w:space="0" w:color="000000"/>
@@ -1092,7 +1098,7 @@
         </w:tc>
         <w:tc>
           <w:tcPr>
-            <w:tcW w:w="3506" w:type="dxa"/>
+            <w:tcW w:w="3507" w:type="dxa"/>
             <w:tcBorders>
               <w:start w:val="single" w:sz="4" w:space="0" w:color="000000"/>
               <w:bottom w:val="single" w:sz="4" w:space="0" w:color="000000"/>
@@ -1114,7 +1120,7 @@
         </w:tc>
         <w:tc>
           <w:tcPr>
-            <w:tcW w:w="3385" w:type="dxa"/>
+            <w:tcW w:w="3384" w:type="dxa"/>
             <w:tcBorders>
               <w:start w:val="single" w:sz="4" w:space="0" w:color="000000"/>
               <w:bottom w:val="single" w:sz="4" w:space="0" w:color="000000"/>
@@ -1140,7 +1146,7 @@
         <w:trPr/>
         <w:tc>
           <w:tcPr>
-            <w:tcW w:w="489" w:type="dxa"/>
+            <w:tcW w:w="488" w:type="dxa"/>
             <w:tcBorders>
               <w:start w:val="single" w:sz="4" w:space="0" w:color="000000"/>
               <w:bottom w:val="single" w:sz="4" w:space="0" w:color="000000"/>
@@ -1181,7 +1187,7 @@
         </w:tc>
         <w:tc>
           <w:tcPr>
-            <w:tcW w:w="3506" w:type="dxa"/>
+            <w:tcW w:w="3507" w:type="dxa"/>
             <w:tcBorders>
               <w:start w:val="single" w:sz="4" w:space="0" w:color="000000"/>
               <w:bottom w:val="single" w:sz="4" w:space="0" w:color="000000"/>
@@ -1203,7 +1209,7 @@
         </w:tc>
         <w:tc>
           <w:tcPr>
-            <w:tcW w:w="3385" w:type="dxa"/>
+            <w:tcW w:w="3384" w:type="dxa"/>
             <w:tcBorders>
               <w:start w:val="single" w:sz="4" w:space="0" w:color="000000"/>
               <w:bottom w:val="single" w:sz="4" w:space="0" w:color="000000"/>
@@ -1229,7 +1235,7 @@
         <w:trPr/>
         <w:tc>
           <w:tcPr>
-            <w:tcW w:w="489" w:type="dxa"/>
+            <w:tcW w:w="488" w:type="dxa"/>
             <w:tcBorders>
               <w:start w:val="single" w:sz="4" w:space="0" w:color="000000"/>
               <w:bottom w:val="single" w:sz="4" w:space="0" w:color="000000"/>
@@ -1270,7 +1276,7 @@
         </w:tc>
         <w:tc>
           <w:tcPr>
-            <w:tcW w:w="3506" w:type="dxa"/>
+            <w:tcW w:w="3507" w:type="dxa"/>
             <w:tcBorders>
               <w:start w:val="single" w:sz="4" w:space="0" w:color="000000"/>
               <w:bottom w:val="single" w:sz="4" w:space="0" w:color="000000"/>
@@ -1292,7 +1298,7 @@
         </w:tc>
         <w:tc>
           <w:tcPr>
-            <w:tcW w:w="3385" w:type="dxa"/>
+            <w:tcW w:w="3384" w:type="dxa"/>
             <w:tcBorders>
               <w:start w:val="single" w:sz="4" w:space="0" w:color="000000"/>
               <w:bottom w:val="single" w:sz="4" w:space="0" w:color="000000"/>

</xml_diff>